<commit_message>
Separated code scripts into modules. Created config files for various BHA testing scenarios.
</commit_message>
<xml_diff>
--- a/gram_analysis/2025_Mar_paper2_BHAfalsepositiverate/Planning/Use Strategies for the BHA.docx
+++ b/gram_analysis/2025_Mar_paper2_BHAfalsepositiverate/Planning/Use Strategies for the BHA.docx
@@ -74,7 +74,13 @@
         </w:numPr>
       </w:pPr>
       <w:r>
-        <w:t>First test at age 60, BHA+ but family dubious. Re-test at 61, some likelihood of learning curve/practice effect leading to false negative BHA.</w:t>
+        <w:t>First test at age 60, BHA</w:t>
+      </w:r>
+      <w:r>
+        <w:t>-</w:t>
+      </w:r>
+      <w:r>
+        <w:t xml:space="preserve"> but family dubious. Re-test at 61, some likelihood of learning curve/practice effect leading to false negative BHA.</w:t>
       </w:r>
     </w:p>
     <w:p>
@@ -147,6 +153,18 @@
       </w:pPr>
       <w:r>
         <w:t xml:space="preserve">Start with first concern. BHA+ is considered final. </w:t>
+      </w:r>
+    </w:p>
+    <w:p>
+      <w:pPr>
+        <w:pStyle w:val="ListParagraph"/>
+        <w:numPr>
+          <w:ilvl w:val="1"/>
+          <w:numId w:val="2"/>
+        </w:numPr>
+      </w:pPr>
+      <w:r>
+        <w:t>Add follow up with specialist</w:t>
       </w:r>
     </w:p>
     <w:p/>
@@ -395,7 +413,7 @@
       <w:lvlText w:val="%2."/>
       <w:lvlJc w:val="left"/>
       <w:pPr>
-        <w:ind w:left="1440" w:hanging="360"/>
+        <w:ind w:left="1530" w:hanging="360"/>
       </w:pPr>
     </w:lvl>
     <w:lvl w:ilvl="2" w:tplc="0409001B" w:tentative="1">

</xml_diff>